<commit_message>
Restore review workflow and harden data imports
</commit_message>
<xml_diff>
--- a/docs/especificacion_tecnica.docx
+++ b/docs/especificacion_tecnica.docx
@@ -38,7 +38,7 @@
     </w:p>
     <w:p>
       <w:r>
-        <w:t>Las salidas comprenden fichas y relaciones consultables, revisión pendiente, historial de deshacer, distribuciones descriptivas y diez archivos CSV por carpeta. La adquisición externa usa fichas públicas GrupLAC o CvLAC, CSV y PDF con texto extraíble. La muestra incluida sirve para representar una fuente concreta y no constituye un censo institucional.</w:t>
+        <w:t>Las salidas comprenden fichas y relaciones consultables, revisión pendiente, historial de deshacer, distribuciones descriptivas y diez archivos CSV por carpeta. La adquisición externa usa fichas públicas GrupLAC o CvLAC, CSV, Excel, Word y PDF con texto extraíble. El conjunto incluido reúne fichas públicas de 66 grupos UPC; no es un censo institucional.</w:t>
       </w:r>
     </w:p>
     <w:p>
@@ -61,7 +61,7 @@
       <w:r>
         <w:drawing>
           <wp:inline xmlns:a="http://schemas.openxmlformats.org/drawingml/2006/main" xmlns:pic="http://schemas.openxmlformats.org/drawingml/2006/picture">
-            <wp:extent cx="5903999" cy="2011050"/>
+            <wp:extent cx="5220000" cy="1778062"/>
             <wp:docPr id="1" name="Picture 1"/>
             <wp:cNvGraphicFramePr>
               <a:graphicFrameLocks noChangeAspect="1"/>
@@ -82,7 +82,7 @@
                   <pic:spPr>
                     <a:xfrm>
                       <a:off x="0" y="0"/>
-                      <a:ext cx="5903999" cy="2011050"/>
+                      <a:ext cx="5220000" cy="1778062"/>
                     </a:xfrm>
                     <a:prstGeom prst="rect"/>
                   </pic:spPr>
@@ -114,7 +114,7 @@
       <w:r>
         <w:drawing>
           <wp:inline xmlns:a="http://schemas.openxmlformats.org/drawingml/2006/main" xmlns:pic="http://schemas.openxmlformats.org/drawingml/2006/picture">
-            <wp:extent cx="5903999" cy="2103300"/>
+            <wp:extent cx="5220000" cy="1859625"/>
             <wp:docPr id="2" name="Picture 2"/>
             <wp:cNvGraphicFramePr>
               <a:graphicFrameLocks noChangeAspect="1"/>
@@ -135,7 +135,7 @@
                   <pic:spPr>
                     <a:xfrm>
                       <a:off x="0" y="0"/>
-                      <a:ext cx="5903999" cy="2103300"/>
+                      <a:ext cx="5220000" cy="1859625"/>
                     </a:xfrm>
                     <a:prstGeom prst="rect"/>
                   </pic:spPr>
@@ -175,7 +175,7 @@
       <w:r>
         <w:drawing>
           <wp:inline xmlns:a="http://schemas.openxmlformats.org/drawingml/2006/main" xmlns:pic="http://schemas.openxmlformats.org/drawingml/2006/picture">
-            <wp:extent cx="5903999" cy="2693700"/>
+            <wp:extent cx="5220000" cy="2381625"/>
             <wp:docPr id="3" name="Picture 3"/>
             <wp:cNvGraphicFramePr>
               <a:graphicFrameLocks noChangeAspect="1"/>
@@ -196,7 +196,7 @@
                   <pic:spPr>
                     <a:xfrm>
                       <a:off x="0" y="0"/>
-                      <a:ext cx="5903999" cy="2693700"/>
+                      <a:ext cx="5220000" cy="2381625"/>
                     </a:xfrm>
                     <a:prstGeom prst="rect"/>
                   </pic:spPr>
@@ -1320,7 +1320,7 @@
     </w:p>
     <w:p>
       <w:r>
-        <w:t>Cada carpeta de datos contiene manifest.csv, cuatro archivos de entidades, tres de relaciones, cola_validacion.csv e historial.csv. El formato común es CSV UTF-8 con encabezados, comillas y saltos de línea conforme al formato CSV. manifest.csv declara la versión 1. Ambos motores validan integridad referencial al cargar. Se preparan archivos temporales y se conserva .backup del guardado previo para recuperación.</w:t>
+        <w:t>Cada carpeta de datos contiene manifest.csv, cuatro archivos de entidades, tres de relaciones, cola_validacion.csv e historial.csv. El formato común es CSV UTF-8 con encabezados, comillas y saltos de línea conforme al formato CSV. manifest.csv declara la versión 2. Ambos motores leen la versión 1 y la migran al guardar. La versión 2 neutraliza los valores que una hoja de cálculo interpretaría como fórmulas y recupera su valor original al cargar. Se valida la integridad referencial. Se preparan archivos temporales y se conserva .backup del guardado previo para recuperación.</w:t>
       </w:r>
     </w:p>
     <w:p>
@@ -1338,12 +1338,35 @@
     </w:p>
     <w:p>
       <w:r>
-        <w:t>Ambos programas importan CSV del esquema PEA-i con vista previa y conteo de filas aceptables o rechazadas. Python además consulta URL públicas HTTP/HTTPS de HTML, texto, CSV o PDF de texto y muestra su contenido antes de crear registros. La extracción estructurada se limita a fichas GrupLAC/CvLAC y metadatos explícitos de artículos. Las páginas de estructura desconocida se limitan a vista previa y captura supervisada.</w:t>
+        <w:t>Ambos programas importan CSV del esquema PEA-i con vista previa y conteo de filas aceptables o rechazadas. Python también admite Excel XLSX y Word DOCX mediante dependencias opcionales, y consulta URL públicas HTTP/HTTPS de HTML, texto, CSV o PDF de texto y muestra su contenido antes de crear registros. La extracción estructurada se limita a fichas GrupLAC/CvLAC y metadatos explícitos de artículos. Las páginas de estructura desconocida se limitan a vista previa y captura supervisada.</w:t>
       </w:r>
     </w:p>
     <w:p>
       <w:r>
-        <w:t>La importación de PDF de texto requiere pdftotext de Poppler. Los escaneos sin texto seleccionable requieren OCR externo. El descargador limita la respuesta a 8 MB, rechaza destinos privados y no convierte contenido de JavaScript o páginas con inicio de sesión en registros inventados. C++ dispone de importación CSV autónoma.</w:t>
+        <w:t>La importación de PDF de texto requiere pdftotext de Poppler. Los escaneos sin texto seleccionable requieren OCR externo. C++ dispone de importación CSV autónoma.</w:t>
+      </w:r>
+    </w:p>
+    <w:p>
+      <w:pPr>
+        <w:pStyle w:val="Heading2"/>
+      </w:pPr>
+      <w:r>
+        <w:t>Controles de seguridad de las fuentes</w:t>
+      </w:r>
+    </w:p>
+    <w:p>
+      <w:r>
+        <w:t>La descarga limita la respuesta a 8 MB, permite solo HTTP y HTTPS en los puertos 80 y 443, rechaza destinos locales o privados y verifica cada redirección. La conexión usa una dirección pública previamente validada, sin proxy heredado del entorno. El tiempo de espera por operación es 15 segundos; no constituye un límite total de duración.</w:t>
+      </w:r>
+    </w:p>
+    <w:p>
+      <w:r>
+        <w:t>Los archivos locales PDF, XLSX y DOCX tienen un límite de 32 MB. Los documentos Office se inspeccionan antes de extraerlos, con un máximo de 10.000 entradas y 128 MB de tamaño declarado sin comprimir. El conversor PDF tiene 25 segundos para extraer hasta cinco millones de caracteres y límites adicionales de CPU y memoria en POSIX. Cada CSV admite hasta 500.000 filas y 100.000 caracteres por campo.</w:t>
+      </w:r>
+    </w:p>
+    <w:p>
+      <w:r>
+        <w:t>El ejecutable Windows incluido se usa cuando su SHA-256 y la huella de las fuentes coinciden. Esas huellas detectan cambios accidentales, pero no autentican al autor. Los parámetros privados de URL se omiten al guardar la procedencia; se retienen solo identificadores públicos necesarios para las fichas GrupLAC y CvLAC.</w:t>
       </w:r>
     </w:p>
     <w:p>
@@ -1366,7 +1389,7 @@
     </w:p>
     <w:p>
       <w:r>
-        <w:t>No se almacena un cubo OLAP materializado. Cada solicitud selecciona una dimensión relacional; la consulta no admite una intersección simultánea de grupo e investigador. La consola muestra tablas y cifras; Tkinter muestra barras por año, tipología y categoría, además de una tabla de productos.</w:t>
+        <w:t>No se almacena un cubo OLAP materializado. Cada solicitud selecciona una dimensión relacional; la consulta no admite una intersección simultánea de grupo e investigador. La consola muestra tablas y cifras; Tkinter muestra barras por año, tipología, categoría y validación, además de una tabla de productos.</w:t>
       </w:r>
     </w:p>
     <w:p>
@@ -2785,7 +2808,7 @@
                 <w:rFonts w:ascii="Liberation Sans" w:hAnsi="Liberation Sans"/>
                 <w:sz w:val="16"/>
               </w:rPr>
-              <w:t>CSV en ambos motores; URL pública y PDF de texto en Python.</w:t>
+              <w:t>CSV en ambos motores; URL pública, PDF, XLSX y DOCX en Python.</w:t>
             </w:r>
           </w:p>
         </w:tc>
@@ -3274,7 +3297,7 @@
                 <w:rFonts w:ascii="Liberation Sans" w:hAnsi="Liberation Sans"/>
                 <w:sz w:val="16"/>
               </w:rPr>
-              <w:t>Operaciones de dominio y esquema CSV versión 1.</w:t>
+              <w:t>Operaciones de dominio y esquema CSV versión 2, con migración de la versión 1.</w:t>
             </w:r>
           </w:p>
         </w:tc>
@@ -3760,7 +3783,7 @@
                 <w:rFonts w:ascii="Liberation Sans" w:hAnsi="Liberation Sans"/>
                 <w:sz w:val="16"/>
               </w:rPr>
-              <w:t>Barras por año, tipología y categoría; tabla paginada.</w:t>
+              <w:t>Barras por año, tipología, categoría y validación; tabla paginada.</w:t>
             </w:r>
           </w:p>
         </w:tc>
@@ -3859,7 +3882,7 @@
                 <w:rFonts w:ascii="Liberation Sans" w:hAnsi="Liberation Sans"/>
                 <w:sz w:val="16"/>
               </w:rPr>
-              <w:t>Selector de inicio y apertura de carpeta CSV.</w:t>
+              <w:t>Carga inicial de data/real, inicio vacío y apertura de carpeta CSV.</w:t>
             </w:r>
           </w:p>
         </w:tc>
@@ -4071,7 +4094,7 @@
     </w:p>
     <w:p>
       <w:r>
-        <w:t>El conjunto data/real es una muestra de la ficha pública del grupo GISICO y del censo de integrantes publicado en GrupLAC. Contiene un grupo, 85 investigadores, 85 membresías, un plan y 202 productos fechados. Los perfiles individuales no se infieren a partir del censo; los campos no publicados permanecen vacíos. La muestra no representa a todos los grupos ni investigadores de la UPC.</w:t>
+        <w:t>El conjunto data/real reúne fichas públicas GrupLAC de 66 grupos UPC. Contiene 2.736 investigadores, 3.291 membresías, 66 planes, 6.363 productos únicos, 6.735 vínculos grupo-producto y 9.703 autorías. Hay 274 investigadores con categoría CvLAC capturada. La categoría del grupo no se asigna a sus productos: cuando la fuente no clasifica un producto, su categoría queda vacía. Las fichas públicas pueden cambiar; este conjunto no constituye un censo institucional actualizado.</w:t>
       </w:r>
     </w:p>
     <w:p>
@@ -4305,7 +4328,7 @@
                 <w:rFonts w:ascii="Liberation Sans" w:hAnsi="Liberation Sans"/>
                 <w:sz w:val="17"/>
               </w:rPr>
-              <w:t>id, nombre, sigla, codigo_gruplac, fecha_creacion, unidad, responsable, categoria, descripcion, objetivos, mision, vision, lineas, url, fuente, activo</w:t>
+              <w:t>id, nombre, codigo_gruplac, fecha_creacion, unidad, responsable, categoria, descripcion, objetivos, mision, vision, lineas, url, fuente, activo</w:t>
             </w:r>
           </w:p>
         </w:tc>
@@ -5523,7 +5546,7 @@
                 <w:rFonts w:ascii="Liberation Sans" w:hAnsi="Liberation Sans"/>
                 <w:sz w:val="16"/>
               </w:rPr>
-              <w:t>Se escriben diez CSV del esquema 1 y se conserva el guardado anterior en .backup.</w:t>
+              <w:t>Se escriben diez CSV del esquema 2 y se conserva el guardado anterior en .backup.</w:t>
             </w:r>
           </w:p>
         </w:tc>
@@ -5917,12 +5940,12 @@
     <w:qFormat/>
     <w:rsid w:val="00FC693F"/>
     <w:pPr>
-      <w:spacing w:after="120" w:line="269" w:lineRule="auto"/>
+      <w:spacing w:after="100" w:line="269" w:lineRule="auto"/>
     </w:pPr>
     <w:rPr>
       <w:rFonts w:ascii="Liberation Sans" w:hAnsi="Liberation Sans"/>
       <w:color w:val="191919"/>
-      <w:sz w:val="19"/>
+      <w:sz w:val="18"/>
     </w:rPr>
   </w:style>
   <w:style w:type="paragraph" w:styleId="Header">
@@ -5985,7 +6008,7 @@
     <w:pPr>
       <w:keepNext/>
       <w:keepLines/>
-      <w:spacing w:before="300" w:after="140"/>
+      <w:spacing w:before="240" w:after="120"/>
       <w:outlineLvl w:val="0"/>
     </w:pPr>
     <w:rPr>

</xml_diff>

<commit_message>
Redesign UI/UX, automate product validation and move to schema v3
- Tkinter UI: automatic filters, full entity sheets, contextual link
  management, paginated name selectors, new "Sierra y sabana" theme
- Product validation is now rule-based in both C++ and Python engines;
  product category removed (GrupLAC does not publish it), schema v3
  with v1/v2 migration, C++ protocol 2
- Regenerated Windows executable and technical specification
- Add GUI regression tests, UI/UX plans, verification guide and
  10-minute presentation script
</commit_message>
<xml_diff>
--- a/docs/especificacion_tecnica.docx
+++ b/docs/especificacion_tecnica.docx
@@ -598,7 +598,7 @@
                 <w:rFonts w:ascii="Liberation Sans" w:hAnsi="Liberation Sans"/>
                 <w:sz w:val="16"/>
               </w:rPr>
-              <w:t>ID, título, año o fecha, familia, tipología, categoría, validación, observación, DOI y fuente.</w:t>
+              <w:t>ID, título, año o fecha, familia, tipología, observación, DOI, URL y fuente; la validación se calcula.</w:t>
             </w:r>
           </w:p>
         </w:tc>
@@ -736,7 +736,7 @@
     <w:p/>
     <w:p>
       <w:r>
-        <w:t>Las salidas estadísticas son total de productos únicos, conteos por año, tipología, categoría y validación, más listas paginadas. Los campos vacíos no se completan con valores supuestos. Las variables exactas de persistencia figuran en el diccionario del apartado 12.</w:t>
+        <w:t>Las salidas estadísticas son total de productos únicos, conteos por año, tipología, validación y reglas incumplidas, más listas paginadas. Los campos vacíos no se completan con valores supuestos. Las variables exactas de persistencia figuran en el diccionario del apartado 12.</w:t>
       </w:r>
     </w:p>
     <w:p>
@@ -1299,7 +1299,15 @@
         <w:pStyle w:val="ListBullet"/>
       </w:pPr>
       <w:r>
-        <w:t>Cambiar categoría o validación de un producto exige una observación nueva. La validación de PEA-i es interna y no equivale a la clasificación oficial de Minciencias.</w:t>
+        <w:t>La validación de un producto es automática: queda validado si tiene año, tipología, una autoría activa de un investigador activo, un vínculo activo con un grupo activo y una URL o un DOI válido. Se recalcula al cambiar el producto o sus vínculos y no equivale a la clasificación oficial de Minciencias.</w:t>
+      </w:r>
+    </w:p>
+    <w:p>
+      <w:pPr>
+        <w:pStyle w:val="ListBullet"/>
+      </w:pPr>
+      <w:r>
+        <w:t>Los productos no tienen categoría: GrupLAC solo publica la clasificación del grupo. La categoría se gestiona en grupos e investigadores y la interfaz la muestra en el módulo de grupos.</w:t>
       </w:r>
     </w:p>
     <w:p>
@@ -1320,7 +1328,7 @@
     </w:p>
     <w:p>
       <w:r>
-        <w:t>Cada carpeta de datos contiene manifest.csv, cuatro archivos de entidades, tres de relaciones, cola_validacion.csv e historial.csv. El formato común es CSV UTF-8 con encabezados, comillas y saltos de línea conforme al formato CSV. manifest.csv declara la versión 2. Ambos motores leen la versión 1 y la migran al guardar. La versión 2 neutraliza los valores que una hoja de cálculo interpretaría como fórmulas y recupera su valor original al cargar. Se valida la integridad referencial. Se preparan archivos temporales y se conserva .backup del guardado previo para recuperación.</w:t>
+        <w:t>Cada carpeta de datos contiene manifest.csv, cuatro archivos de entidades, tres de relaciones, cola_validacion.csv e historial.csv. El formato común es CSV UTF-8 con encabezados, comillas y saltos de línea conforme al formato CSV. manifest.csv declara la versión 3. Ambos motores leen las versiones 1 y 2 y las migran al guardar; una categoría de producto anterior se conserva en la observación. El formato neutraliza los valores que una hoja de cálculo interpretaría como fórmulas y recupera su valor original al cargar. Se valida la integridad referencial. Se preparan archivos temporales y se conserva .backup del guardado previo para recuperación.</w:t>
       </w:r>
     </w:p>
     <w:p>
@@ -1379,7 +1387,7 @@
     </w:p>
     <w:p>
       <w:r>
-        <w:t>El hipercubo se implementa como consulta multidimensional calculada bajo demanda: cada producto es un hecho único; grupo e investigador son dimensiones relacionales, y año, tipología, categoría y validación son atributos de análisis. La vista selecciona todos los productos o un grupo, investigador o producto. Después se aplican rango de años, categoría y estado; el resultado se agrupa por año, tipología, categoría y validación.</w:t>
+        <w:t>El hipercubo se implementa como consulta multidimensional calculada bajo demanda: cada producto es un hecho único; grupo e investigador son dimensiones relacionales, y año, tipología y validación son atributos de análisis. La vista selecciona todos los productos o un grupo, investigador o producto. Después se aplican rango de años y estado de validación; el resultado se agrupa por año, tipología, validación y reglas incumplidas.</w:t>
       </w:r>
     </w:p>
     <w:p>
@@ -1389,7 +1397,7 @@
     </w:p>
     <w:p>
       <w:r>
-        <w:t>No se almacena un cubo OLAP materializado. Cada solicitud selecciona una dimensión relacional; la consulta no admite una intersección simultánea de grupo e investigador. La consola muestra tablas y cifras; Tkinter muestra barras por año, tipología, categoría y validación, además de una tabla de productos.</w:t>
+        <w:t>No se almacena un cubo OLAP materializado. Cada solicitud selecciona una dimensión relacional; la consulta no admite una intersección simultánea de grupo e investigador. La consola muestra tablas y cifras; Tkinter muestra barras por año, tipología, validación y reglas incumplidas, además de una tabla de productos.</w:t>
       </w:r>
     </w:p>
     <w:p>
@@ -1903,7 +1911,7 @@
                 <w:rFonts w:ascii="Liberation Sans" w:hAnsi="Liberation Sans"/>
                 <w:sz w:val="16"/>
               </w:rPr>
-              <w:t>Las vistas por grupo, investigador y producto respetan años, categoría y validación.</w:t>
+              <w:t>Las vistas por grupo, investigador y producto respetan años y validación.</w:t>
             </w:r>
           </w:p>
         </w:tc>
@@ -2517,7 +2525,7 @@
                 <w:rFonts w:ascii="Liberation Sans" w:hAnsi="Liberation Sans"/>
                 <w:sz w:val="16"/>
               </w:rPr>
-              <w:t>Registro con fecha, tipología, categoría, validación y DOI.</w:t>
+              <w:t>Registro con fecha, tipología, DOI y URL; validación automática.</w:t>
             </w:r>
           </w:p>
         </w:tc>
@@ -3297,7 +3305,7 @@
                 <w:rFonts w:ascii="Liberation Sans" w:hAnsi="Liberation Sans"/>
                 <w:sz w:val="16"/>
               </w:rPr>
-              <w:t>Operaciones de dominio y esquema CSV versión 2, con migración de la versión 1.</w:t>
+              <w:t>Operaciones de dominio y esquema CSV versión 3, con migración de las versiones 1 y 2.</w:t>
             </w:r>
           </w:p>
         </w:tc>
@@ -3393,7 +3401,7 @@
                 <w:rFonts w:ascii="Liberation Sans" w:hAnsi="Liberation Sans"/>
                 <w:sz w:val="16"/>
               </w:rPr>
-              <w:t>Actualización condicionada a observación nueva.</w:t>
+              <w:t>Categoría en grupos e investigadores; validación de productos por reglas, recalculada en cada cambio.</w:t>
             </w:r>
           </w:p>
         </w:tc>
@@ -3783,7 +3791,7 @@
                 <w:rFonts w:ascii="Liberation Sans" w:hAnsi="Liberation Sans"/>
                 <w:sz w:val="16"/>
               </w:rPr>
-              <w:t>Barras por año, tipología, categoría y validación; tabla paginada.</w:t>
+              <w:t>Barras por año, tipología, validación y reglas incumplidas; tabla paginada.</w:t>
             </w:r>
           </w:p>
         </w:tc>
@@ -4094,7 +4102,7 @@
     </w:p>
     <w:p>
       <w:r>
-        <w:t>El conjunto data/real reúne fichas públicas GrupLAC de 66 grupos UPC. Contiene 2.736 investigadores, 3.291 membresías, 66 planes, 6.363 productos únicos, 6.735 vínculos grupo-producto y 9.703 autorías. Hay 274 investigadores con categoría CvLAC capturada. La categoría del grupo no se asigna a sus productos: cuando la fuente no clasifica un producto, su categoría queda vacía. Las fichas públicas pueden cambiar; este conjunto no constituye un censo institucional actualizado.</w:t>
+        <w:t>El conjunto data/real reúne fichas públicas GrupLAC de 66 grupos UPC. Contiene 2.736 investigadores, 3.291 membresías, 66 planes, 6.363 productos únicos, 6.735 vínculos grupo-producto y 9.703 autorías. Hay 274 investigadores con categoría CvLAC capturada. La validación automática deja 6.323 productos validados y 40 rechazados (37 sin autor del censo y 3 con DOI mal formado). Las fichas públicas pueden cambiar; este conjunto no constituye un censo institucional actualizado.</w:t>
       </w:r>
     </w:p>
     <w:p>
@@ -4462,7 +4470,7 @@
                 <w:rFonts w:ascii="Liberation Sans" w:hAnsi="Liberation Sans"/>
                 <w:sz w:val="17"/>
               </w:rPr>
-              <w:t>id, titulo, anio, fecha, familia, tipologia, categoria, validacion, observacion, doi, url, fuente, activo</w:t>
+              <w:t>id, titulo, anio, fecha, familia, tipologia, validacion, observacion, doi, url, fuente, activo</w:t>
             </w:r>
           </w:p>
         </w:tc>
@@ -5291,7 +5299,7 @@
                 <w:rFonts w:ascii="Liberation Sans" w:hAnsi="Liberation Sans"/>
                 <w:sz w:val="16"/>
               </w:rPr>
-              <w:t>Actualizar validación</w:t>
+              <w:t>Cerrar revisión</w:t>
             </w:r>
           </w:p>
         </w:tc>
@@ -5321,7 +5329,7 @@
                 <w:rFonts w:ascii="Liberation Sans" w:hAnsi="Liberation Sans"/>
                 <w:sz w:val="16"/>
               </w:rPr>
-              <w:t>Producto existente, estado permitido y observación nueva.</w:t>
+              <w:t>Cola no vacía y nota de revisión no vacía.</w:t>
             </w:r>
           </w:p>
         </w:tc>
@@ -5351,7 +5359,7 @@
                 <w:rFonts w:ascii="Liberation Sans" w:hAnsi="Liberation Sans"/>
                 <w:sz w:val="16"/>
               </w:rPr>
-              <w:t>Se conserva el nuevo estado y la modificación entra en la pila de deshacer.</w:t>
+              <w:t>La nota queda en la observación, el producto sale del frente y la acción entra en la pila; la validación se recalcula sola.</w:t>
             </w:r>
           </w:p>
         </w:tc>
@@ -5546,7 +5554,7 @@
                 <w:rFonts w:ascii="Liberation Sans" w:hAnsi="Liberation Sans"/>
                 <w:sz w:val="16"/>
               </w:rPr>
-              <w:t>Se escriben diez CSV del esquema 2 y se conserva el guardado anterior en .backup.</w:t>
+              <w:t>Se escriben diez CSV del esquema 3 y se conserva el guardado anterior en .backup.</w:t>
             </w:r>
           </w:p>
         </w:tc>

</xml_diff>